<commit_message>
Added robotarium submission files
</commit_message>
<xml_diff>
--- a/experiment_design_E1_E2.docx
+++ b/experiment_design_E1_E2.docx
@@ -3106,6 +3106,639 @@
           <w:i/>
         </w:rPr>
         <w:t>Figure 5. Stigmergy search visit-count heatmap. The maximum visit count is 19.</w:t>
+      </w:r>
+    </w:p>
+    <w:p>
+      <w:pPr>
+        <w:pStyle w:val="Heading1"/>
+      </w:pPr>
+      <w:r>
+        <w:t>Robotarium E1 and E2 Submission Plan</w:t>
+      </w:r>
+    </w:p>
+    <w:p>
+      <w:r>
+        <w:t xml:space="preserve">This section records the Robotarium-specific choices used for E1 and E2. The purpose is to keep centralized, stigmergy random walk, and stigmergy search comparable under identical target placement, identical initial robot positions, and controlled random decisions inside the </w:t>
+      </w:r>
+      <w:proofErr w:type="spellStart"/>
+      <w:r>
+        <w:t>stigmergy</w:t>
+      </w:r>
+      <w:proofErr w:type="spellEnd"/>
+      <w:r>
+        <w:t xml:space="preserve"> policies.</w:t>
+      </w:r>
+    </w:p>
+    <w:p/>
+    <w:p/>
+    <w:p>
+      <w:pPr>
+        <w:pStyle w:val="Heading2"/>
+      </w:pPr>
+      <w:r>
+        <w:lastRenderedPageBreak/>
+        <w:t>Robotarium configuration summary</w:t>
+      </w:r>
+    </w:p>
+    <w:tbl>
+      <w:tblPr>
+        <w:tblW w:w="0" w:type="auto"/>
+        <w:tblBorders>
+          <w:top w:val="single" w:sz="4" w:space="0" w:color="auto"/>
+          <w:left w:val="single" w:sz="4" w:space="0" w:color="auto"/>
+          <w:bottom w:val="single" w:sz="4" w:space="0" w:color="auto"/>
+          <w:right w:val="single" w:sz="4" w:space="0" w:color="auto"/>
+          <w:insideH w:val="single" w:sz="4" w:space="0" w:color="auto"/>
+          <w:insideV w:val="single" w:sz="4" w:space="0" w:color="auto"/>
+        </w:tblBorders>
+        <w:tblLook w:val="04A0" w:firstRow="1" w:lastRow="0" w:firstColumn="1" w:lastColumn="0" w:noHBand="0" w:noVBand="1"/>
+      </w:tblPr>
+      <w:tblGrid>
+        <w:gridCol w:w="2400"/>
+        <w:gridCol w:w="3018"/>
+        <w:gridCol w:w="2400"/>
+      </w:tblGrid>
+      <w:tr>
+        <w:tc>
+          <w:tcPr>
+            <w:tcW w:w="2400" w:type="dxa"/>
+          </w:tcPr>
+          <w:p>
+            <w:r>
+              <w:rPr>
+                <w:b/>
+              </w:rPr>
+              <w:t>Item</w:t>
+            </w:r>
+          </w:p>
+        </w:tc>
+        <w:tc>
+          <w:tcPr>
+            <w:tcW w:w="2400" w:type="dxa"/>
+          </w:tcPr>
+          <w:p>
+            <w:r>
+              <w:rPr>
+                <w:b/>
+              </w:rPr>
+              <w:t>Decision</w:t>
+            </w:r>
+          </w:p>
+        </w:tc>
+        <w:tc>
+          <w:tcPr>
+            <w:tcW w:w="2400" w:type="dxa"/>
+          </w:tcPr>
+          <w:p>
+            <w:r>
+              <w:rPr>
+                <w:b/>
+              </w:rPr>
+              <w:t>Reason</w:t>
+            </w:r>
+          </w:p>
+        </w:tc>
+      </w:tr>
+      <w:tr>
+        <w:tc>
+          <w:tcPr>
+            <w:tcW w:w="2400" w:type="dxa"/>
+          </w:tcPr>
+          <w:p>
+            <w:r>
+              <w:t>Robot count</w:t>
+            </w:r>
+          </w:p>
+        </w:tc>
+        <w:tc>
+          <w:tcPr>
+            <w:tcW w:w="2400" w:type="dxa"/>
+          </w:tcPr>
+          <w:p>
+            <w:r>
+              <w:t>5 robots for E1 and E2</w:t>
+            </w:r>
+          </w:p>
+        </w:tc>
+        <w:tc>
+          <w:tcPr>
+            <w:tcW w:w="2400" w:type="dxa"/>
+          </w:tcPr>
+          <w:p>
+            <w:r>
+              <w:t>Matches the Robotarium submission setting used for these scripts.</w:t>
+            </w:r>
+          </w:p>
+        </w:tc>
+      </w:tr>
+      <w:tr>
+        <w:tc>
+          <w:tcPr>
+            <w:tcW w:w="2400" w:type="dxa"/>
+          </w:tcPr>
+          <w:p>
+            <w:r>
+              <w:t>Target count</w:t>
+            </w:r>
+          </w:p>
+        </w:tc>
+        <w:tc>
+          <w:tcPr>
+            <w:tcW w:w="2400" w:type="dxa"/>
+          </w:tcPr>
+          <w:p>
+            <w:r>
+              <w:t>10 targets for E1 and E2</w:t>
+            </w:r>
+          </w:p>
+        </w:tc>
+        <w:tc>
+          <w:tcPr>
+            <w:tcW w:w="2400" w:type="dxa"/>
+          </w:tcPr>
+          <w:p>
+            <w:r>
+              <w:t>Keeps the target set fixed across algorithms for direct comparison.</w:t>
+            </w:r>
+          </w:p>
+        </w:tc>
+      </w:tr>
+      <w:tr>
+        <w:tc>
+          <w:tcPr>
+            <w:tcW w:w="2400" w:type="dxa"/>
+          </w:tcPr>
+          <w:p>
+            <w:r>
+              <w:t>Initial positions</w:t>
+            </w:r>
+          </w:p>
+        </w:tc>
+        <w:tc>
+          <w:tcPr>
+            <w:tcW w:w="2400" w:type="dxa"/>
+          </w:tcPr>
+          <w:p>
+            <w:r>
+              <w:t>Robots start at the first waypoint of the centralized lawnmower path: [(1, 22), (17, 24), (34, 25), (1, 1), (25, 1)]</w:t>
+            </w:r>
+          </w:p>
+        </w:tc>
+        <w:tc>
+          <w:tcPr>
+            <w:tcW w:w="2400" w:type="dxa"/>
+          </w:tcPr>
+          <w:p>
+            <w:r>
+              <w:t>Avoids random initial overlap and gives stigmergy runs the same physical starts as centralized.</w:t>
+            </w:r>
+          </w:p>
+        </w:tc>
+      </w:tr>
+      <w:tr>
+        <w:tc>
+          <w:tcPr>
+            <w:tcW w:w="2400" w:type="dxa"/>
+          </w:tcPr>
+          <w:p>
+            <w:r>
+              <w:t>Target seed</w:t>
+            </w:r>
+          </w:p>
+        </w:tc>
+        <w:tc>
+          <w:tcPr>
+            <w:tcW w:w="2400" w:type="dxa"/>
+          </w:tcPr>
+          <w:p>
+            <w:r>
+              <w:t>TARGET_RANDOM_SEED = 7</w:t>
+            </w:r>
+          </w:p>
+        </w:tc>
+        <w:tc>
+          <w:tcPr>
+            <w:tcW w:w="2400" w:type="dxa"/>
+          </w:tcPr>
+          <w:p>
+            <w:r>
+              <w:t>All three Robotarium scripts generate the same target set.</w:t>
+            </w:r>
+          </w:p>
+        </w:tc>
+      </w:tr>
+      <w:tr>
+        <w:tc>
+          <w:tcPr>
+            <w:tcW w:w="2400" w:type="dxa"/>
+          </w:tcPr>
+          <w:p>
+            <w:r>
+              <w:t>Start seed</w:t>
+            </w:r>
+          </w:p>
+        </w:tc>
+        <w:tc>
+          <w:tcPr>
+            <w:tcW w:w="2400" w:type="dxa"/>
+          </w:tcPr>
+          <w:p>
+            <w:r>
+              <w:t>START_RANDOM_SEED = 7</w:t>
+            </w:r>
+          </w:p>
+        </w:tc>
+        <w:tc>
+          <w:tcPr>
+            <w:tcW w:w="2400" w:type="dxa"/>
+          </w:tcPr>
+          <w:p>
+            <w:r>
+              <w:t>Robot orientations and centralized lawnmower start generation are repeatable.</w:t>
+            </w:r>
+          </w:p>
+        </w:tc>
+      </w:tr>
+      <w:tr>
+        <w:tc>
+          <w:tcPr>
+            <w:tcW w:w="2400" w:type="dxa"/>
+          </w:tcPr>
+          <w:p>
+            <w:r>
+              <w:t>Stigmergy policy seed</w:t>
+            </w:r>
+          </w:p>
+        </w:tc>
+        <w:tc>
+          <w:tcPr>
+            <w:tcW w:w="2400" w:type="dxa"/>
+          </w:tcPr>
+          <w:p>
+            <w:r>
+              <w:t>ALGORITHM_RANDOM_SEED = 107</w:t>
+            </w:r>
+          </w:p>
+        </w:tc>
+        <w:tc>
+          <w:tcPr>
+            <w:tcW w:w="2400" w:type="dxa"/>
+          </w:tcPr>
+          <w:p>
+            <w:r>
+              <w:t>Random walk and stigmergy search use the same independent stochastic stream, separate from targets and starts.</w:t>
+            </w:r>
+          </w:p>
+        </w:tc>
+      </w:tr>
+      <w:tr>
+        <w:tc>
+          <w:tcPr>
+            <w:tcW w:w="2400" w:type="dxa"/>
+          </w:tcPr>
+          <w:p>
+            <w:r>
+              <w:t>Failure seed</w:t>
+            </w:r>
+          </w:p>
+        </w:tc>
+        <w:tc>
+          <w:tcPr>
+            <w:tcW w:w="2400" w:type="dxa"/>
+          </w:tcPr>
+          <w:p>
+            <w:r>
+              <w:t>FAILURE_RANDOM_SEED = 207</w:t>
+            </w:r>
+          </w:p>
+        </w:tc>
+        <w:tc>
+          <w:tcPr>
+            <w:tcW w:w="2400" w:type="dxa"/>
+          </w:tcPr>
+          <w:p>
+            <w:r>
+              <w:t>E2 uses the same failed robot IDs and failure times across all algorithms.</w:t>
+            </w:r>
+          </w:p>
+        </w:tc>
+      </w:tr>
+    </w:tbl>
+    <w:p>
+      <w:pPr>
+        <w:pStyle w:val="Heading2"/>
+      </w:pPr>
+    </w:p>
+    <w:p>
+      <w:pPr>
+        <w:pStyle w:val="Heading2"/>
+      </w:pPr>
+    </w:p>
+    <w:p>
+      <w:pPr>
+        <w:pStyle w:val="Heading2"/>
+      </w:pPr>
+      <w:r>
+        <w:lastRenderedPageBreak/>
+        <w:t>E1 and E2 run plan</w:t>
+      </w:r>
+    </w:p>
+    <w:tbl>
+      <w:tblPr>
+        <w:tblW w:w="0" w:type="auto"/>
+        <w:tblBorders>
+          <w:top w:val="single" w:sz="4" w:space="0" w:color="auto"/>
+          <w:left w:val="single" w:sz="4" w:space="0" w:color="auto"/>
+          <w:bottom w:val="single" w:sz="4" w:space="0" w:color="auto"/>
+          <w:right w:val="single" w:sz="4" w:space="0" w:color="auto"/>
+          <w:insideH w:val="single" w:sz="4" w:space="0" w:color="auto"/>
+          <w:insideV w:val="single" w:sz="4" w:space="0" w:color="auto"/>
+        </w:tblBorders>
+        <w:tblLook w:val="04A0" w:firstRow="1" w:lastRow="0" w:firstColumn="1" w:lastColumn="0" w:noHBand="0" w:noVBand="1"/>
+      </w:tblPr>
+      <w:tblGrid>
+        <w:gridCol w:w="1602"/>
+        <w:gridCol w:w="2315"/>
+        <w:gridCol w:w="1603"/>
+        <w:gridCol w:w="1485"/>
+        <w:gridCol w:w="1485"/>
+        <w:gridCol w:w="1086"/>
+      </w:tblGrid>
+      <w:tr>
+        <w:tc>
+          <w:tcPr>
+            <w:tcW w:w="2400" w:type="dxa"/>
+          </w:tcPr>
+          <w:p>
+            <w:r>
+              <w:rPr>
+                <w:b/>
+              </w:rPr>
+              <w:t>Experiment</w:t>
+            </w:r>
+          </w:p>
+        </w:tc>
+        <w:tc>
+          <w:tcPr>
+            <w:tcW w:w="2400" w:type="dxa"/>
+          </w:tcPr>
+          <w:p>
+            <w:r>
+              <w:rPr>
+                <w:b/>
+              </w:rPr>
+              <w:t>Failure setting</w:t>
+            </w:r>
+          </w:p>
+        </w:tc>
+        <w:tc>
+          <w:tcPr>
+            <w:tcW w:w="2400" w:type="dxa"/>
+          </w:tcPr>
+          <w:p>
+            <w:r>
+              <w:rPr>
+                <w:b/>
+              </w:rPr>
+              <w:t>Centralized runs</w:t>
+            </w:r>
+          </w:p>
+        </w:tc>
+        <w:tc>
+          <w:tcPr>
+            <w:tcW w:w="2400" w:type="dxa"/>
+          </w:tcPr>
+          <w:p>
+            <w:r>
+              <w:rPr>
+                <w:b/>
+              </w:rPr>
+              <w:t>Stigmergy random walk runs</w:t>
+            </w:r>
+          </w:p>
+        </w:tc>
+        <w:tc>
+          <w:tcPr>
+            <w:tcW w:w="2400" w:type="dxa"/>
+          </w:tcPr>
+          <w:p>
+            <w:r>
+              <w:rPr>
+                <w:b/>
+              </w:rPr>
+              <w:t>Stigmergy search runs</w:t>
+            </w:r>
+          </w:p>
+        </w:tc>
+        <w:tc>
+          <w:tcPr>
+            <w:tcW w:w="2400" w:type="dxa"/>
+          </w:tcPr>
+          <w:p>
+            <w:r>
+              <w:rPr>
+                <w:b/>
+              </w:rPr>
+              <w:t>Total runs</w:t>
+            </w:r>
+          </w:p>
+        </w:tc>
+      </w:tr>
+      <w:tr>
+        <w:tc>
+          <w:tcPr>
+            <w:tcW w:w="2400" w:type="dxa"/>
+          </w:tcPr>
+          <w:p>
+            <w:r>
+              <w:t>E1</w:t>
+            </w:r>
+          </w:p>
+        </w:tc>
+        <w:tc>
+          <w:tcPr>
+            <w:tcW w:w="2400" w:type="dxa"/>
+          </w:tcPr>
+          <w:p>
+            <w:r>
+              <w:t>No failures</w:t>
+            </w:r>
+          </w:p>
+        </w:tc>
+        <w:tc>
+          <w:tcPr>
+            <w:tcW w:w="2400" w:type="dxa"/>
+          </w:tcPr>
+          <w:p>
+            <w:r>
+              <w:t>1</w:t>
+            </w:r>
+          </w:p>
+        </w:tc>
+        <w:tc>
+          <w:tcPr>
+            <w:tcW w:w="2400" w:type="dxa"/>
+          </w:tcPr>
+          <w:p>
+            <w:r>
+              <w:t>5</w:t>
+            </w:r>
+          </w:p>
+        </w:tc>
+        <w:tc>
+          <w:tcPr>
+            <w:tcW w:w="2400" w:type="dxa"/>
+          </w:tcPr>
+          <w:p>
+            <w:r>
+              <w:t>5</w:t>
+            </w:r>
+          </w:p>
+        </w:tc>
+        <w:tc>
+          <w:tcPr>
+            <w:tcW w:w="2400" w:type="dxa"/>
+          </w:tcPr>
+          <w:p>
+            <w:r>
+              <w:t>11</w:t>
+            </w:r>
+          </w:p>
+        </w:tc>
+      </w:tr>
+      <w:tr>
+        <w:tc>
+          <w:tcPr>
+            <w:tcW w:w="2400" w:type="dxa"/>
+          </w:tcPr>
+          <w:p>
+            <w:r>
+              <w:t>E2</w:t>
+            </w:r>
+          </w:p>
+        </w:tc>
+        <w:tc>
+          <w:tcPr>
+            <w:tcW w:w="2400" w:type="dxa"/>
+          </w:tcPr>
+          <w:p>
+            <w:r>
+              <w:t>2 robot failures using FAILURE_TIME_MODE = mixed</w:t>
+            </w:r>
+          </w:p>
+        </w:tc>
+        <w:tc>
+          <w:tcPr>
+            <w:tcW w:w="2400" w:type="dxa"/>
+          </w:tcPr>
+          <w:p>
+            <w:r>
+              <w:t>1</w:t>
+            </w:r>
+          </w:p>
+        </w:tc>
+        <w:tc>
+          <w:tcPr>
+            <w:tcW w:w="2400" w:type="dxa"/>
+          </w:tcPr>
+          <w:p>
+            <w:r>
+              <w:t>5</w:t>
+            </w:r>
+          </w:p>
+        </w:tc>
+        <w:tc>
+          <w:tcPr>
+            <w:tcW w:w="2400" w:type="dxa"/>
+          </w:tcPr>
+          <w:p>
+            <w:r>
+              <w:t>5</w:t>
+            </w:r>
+          </w:p>
+        </w:tc>
+        <w:tc>
+          <w:tcPr>
+            <w:tcW w:w="2400" w:type="dxa"/>
+          </w:tcPr>
+          <w:p>
+            <w:r>
+              <w:t>11</w:t>
+            </w:r>
+          </w:p>
+        </w:tc>
+      </w:tr>
+      <w:tr>
+        <w:tc>
+          <w:tcPr>
+            <w:tcW w:w="2400" w:type="dxa"/>
+          </w:tcPr>
+          <w:p>
+            <w:r>
+              <w:t>Combined</w:t>
+            </w:r>
+          </w:p>
+        </w:tc>
+        <w:tc>
+          <w:tcPr>
+            <w:tcW w:w="2400" w:type="dxa"/>
+          </w:tcPr>
+          <w:p>
+            <w:r>
+              <w:t>E1 plus E2</w:t>
+            </w:r>
+          </w:p>
+        </w:tc>
+        <w:tc>
+          <w:tcPr>
+            <w:tcW w:w="2400" w:type="dxa"/>
+          </w:tcPr>
+          <w:p>
+            <w:r>
+              <w:t>2</w:t>
+            </w:r>
+          </w:p>
+        </w:tc>
+        <w:tc>
+          <w:tcPr>
+            <w:tcW w:w="2400" w:type="dxa"/>
+          </w:tcPr>
+          <w:p>
+            <w:r>
+              <w:t>10</w:t>
+            </w:r>
+          </w:p>
+        </w:tc>
+        <w:tc>
+          <w:tcPr>
+            <w:tcW w:w="2400" w:type="dxa"/>
+          </w:tcPr>
+          <w:p>
+            <w:r>
+              <w:t>10</w:t>
+            </w:r>
+          </w:p>
+        </w:tc>
+        <w:tc>
+          <w:tcPr>
+            <w:tcW w:w="2400" w:type="dxa"/>
+          </w:tcPr>
+          <w:p>
+            <w:r>
+              <w:t>22</w:t>
+            </w:r>
+          </w:p>
+        </w:tc>
+      </w:tr>
+    </w:tbl>
+    <w:p>
+      <w:r>
+        <w:t>For E2, failure times are generated with make_random_failure_schedule from config_experiments.py using FAILURE_TIME_MODE = mixed. The failure helper is present in each Robotarium common file, but failures are disabled by default with E2_FAILURES_ENABLED = False. For E1, leave this flag false. For E2, set E2_FAILURES_ENABLED = True and E2_N_FAILURES = 2 in the three Robotarium common files before submission.</w:t>
+      </w:r>
+    </w:p>
+    <w:p>
+      <w:r>
+        <w:t>The centralized algorithm is deterministic under the fixed lawnmower partition seed, so one run is recorded for each experiment. The two stigmergy algorithms are stochastic, so each is run five times with the same target set and initial robot positions while varying only the random decisions made by the stigmergy policy across repeated submissions.</w:t>
       </w:r>
     </w:p>
     <w:sectPr>

</xml_diff>

<commit_message>
Added updated results from experimentation
</commit_message>
<xml_diff>
--- a/experiment_design_E1_E2.docx
+++ b/experiment_design_E1_E2.docx
@@ -2087,16 +2087,16 @@
         <w:tblLook w:val="04A0" w:firstRow="1" w:lastRow="0" w:firstColumn="1" w:lastColumn="0" w:noHBand="0" w:noVBand="1"/>
       </w:tblPr>
       <w:tblGrid>
-        <w:gridCol w:w="1973"/>
-        <w:gridCol w:w="2003"/>
-        <w:gridCol w:w="1771"/>
-        <w:gridCol w:w="1809"/>
-        <w:gridCol w:w="1809"/>
+        <w:gridCol w:w="1970"/>
+        <w:gridCol w:w="2000"/>
+        <w:gridCol w:w="1766"/>
+        <w:gridCol w:w="1804"/>
+        <w:gridCol w:w="1805"/>
       </w:tblGrid>
       <w:tr>
         <w:tc>
           <w:tcPr>
-            <w:tcW w:w="2400" w:type="dxa"/>
+            <w:tcW w:w="1973" w:type="dxa"/>
           </w:tcPr>
           <w:p>
             <w:pPr>
@@ -2112,7 +2112,7 @@
         </w:tc>
         <w:tc>
           <w:tcPr>
-            <w:tcW w:w="2400" w:type="dxa"/>
+            <w:tcW w:w="2003" w:type="dxa"/>
           </w:tcPr>
           <w:p>
             <w:pPr>
@@ -2128,7 +2128,7 @@
         </w:tc>
         <w:tc>
           <w:tcPr>
-            <w:tcW w:w="2400" w:type="dxa"/>
+            <w:tcW w:w="1771" w:type="dxa"/>
           </w:tcPr>
           <w:p>
             <w:pPr>
@@ -2144,7 +2144,7 @@
         </w:tc>
         <w:tc>
           <w:tcPr>
-            <w:tcW w:w="2400" w:type="dxa"/>
+            <w:tcW w:w="1809" w:type="dxa"/>
           </w:tcPr>
           <w:p>
             <w:pPr>
@@ -2160,7 +2160,7 @@
         </w:tc>
         <w:tc>
           <w:tcPr>
-            <w:tcW w:w="2400" w:type="dxa"/>
+            <w:tcW w:w="1809" w:type="dxa"/>
           </w:tcPr>
           <w:p>
             <w:pPr>
@@ -2178,7 +2178,7 @@
       <w:tr>
         <w:tc>
           <w:tcPr>
-            <w:tcW w:w="2400" w:type="dxa"/>
+            <w:tcW w:w="1973" w:type="dxa"/>
           </w:tcPr>
           <w:p>
             <w:pPr>
@@ -2191,7 +2191,7 @@
         </w:tc>
         <w:tc>
           <w:tcPr>
-            <w:tcW w:w="2400" w:type="dxa"/>
+            <w:tcW w:w="2003" w:type="dxa"/>
           </w:tcPr>
           <w:p>
             <w:pPr>
@@ -2204,7 +2204,7 @@
         </w:tc>
         <w:tc>
           <w:tcPr>
-            <w:tcW w:w="2400" w:type="dxa"/>
+            <w:tcW w:w="1771" w:type="dxa"/>
           </w:tcPr>
           <w:p>
             <w:pPr>
@@ -2217,7 +2217,7 @@
         </w:tc>
         <w:tc>
           <w:tcPr>
-            <w:tcW w:w="2400" w:type="dxa"/>
+            <w:tcW w:w="1809" w:type="dxa"/>
           </w:tcPr>
           <w:p>
             <w:pPr>
@@ -2230,7 +2230,7 @@
         </w:tc>
         <w:tc>
           <w:tcPr>
-            <w:tcW w:w="2400" w:type="dxa"/>
+            <w:tcW w:w="1809" w:type="dxa"/>
           </w:tcPr>
           <w:p>
             <w:pPr>
@@ -2245,20 +2245,20 @@
       <w:tr>
         <w:tc>
           <w:tcPr>
-            <w:tcW w:w="2400" w:type="dxa"/>
-          </w:tcPr>
-          <w:p>
-            <w:pPr>
-              <w:jc w:val="center"/>
-            </w:pPr>
-            <w:r>
-              <w:t>Stigmergy random walk</w:t>
-            </w:r>
-          </w:p>
-        </w:tc>
-        <w:tc>
-          <w:tcPr>
-            <w:tcW w:w="2400" w:type="dxa"/>
+            <w:tcW w:w="1973" w:type="dxa"/>
+          </w:tcPr>
+          <w:p>
+            <w:pPr>
+              <w:jc w:val="center"/>
+            </w:pPr>
+            <w:r>
+              <w:t>random walk</w:t>
+            </w:r>
+          </w:p>
+        </w:tc>
+        <w:tc>
+          <w:tcPr>
+            <w:tcW w:w="2003" w:type="dxa"/>
           </w:tcPr>
           <w:p>
             <w:pPr>
@@ -2271,7 +2271,7 @@
         </w:tc>
         <w:tc>
           <w:tcPr>
-            <w:tcW w:w="2400" w:type="dxa"/>
+            <w:tcW w:w="1771" w:type="dxa"/>
           </w:tcPr>
           <w:p>
             <w:pPr>
@@ -2284,7 +2284,7 @@
         </w:tc>
         <w:tc>
           <w:tcPr>
-            <w:tcW w:w="2400" w:type="dxa"/>
+            <w:tcW w:w="1809" w:type="dxa"/>
           </w:tcPr>
           <w:p>
             <w:pPr>
@@ -2297,7 +2297,7 @@
         </w:tc>
         <w:tc>
           <w:tcPr>
-            <w:tcW w:w="2400" w:type="dxa"/>
+            <w:tcW w:w="1809" w:type="dxa"/>
           </w:tcPr>
           <w:p>
             <w:pPr>
@@ -2312,7 +2312,7 @@
       <w:tr>
         <w:tc>
           <w:tcPr>
-            <w:tcW w:w="2400" w:type="dxa"/>
+            <w:tcW w:w="1973" w:type="dxa"/>
           </w:tcPr>
           <w:p>
             <w:pPr>
@@ -2325,7 +2325,7 @@
         </w:tc>
         <w:tc>
           <w:tcPr>
-            <w:tcW w:w="2400" w:type="dxa"/>
+            <w:tcW w:w="2003" w:type="dxa"/>
           </w:tcPr>
           <w:p>
             <w:pPr>
@@ -2338,7 +2338,7 @@
         </w:tc>
         <w:tc>
           <w:tcPr>
-            <w:tcW w:w="2400" w:type="dxa"/>
+            <w:tcW w:w="1771" w:type="dxa"/>
           </w:tcPr>
           <w:p>
             <w:pPr>
@@ -2351,7 +2351,7 @@
         </w:tc>
         <w:tc>
           <w:tcPr>
-            <w:tcW w:w="2400" w:type="dxa"/>
+            <w:tcW w:w="1809" w:type="dxa"/>
           </w:tcPr>
           <w:p>
             <w:pPr>
@@ -2364,7 +2364,7 @@
         </w:tc>
         <w:tc>
           <w:tcPr>
-            <w:tcW w:w="2400" w:type="dxa"/>
+            <w:tcW w:w="1809" w:type="dxa"/>
           </w:tcPr>
           <w:p>
             <w:pPr>
@@ -2379,74 +2379,7 @@
       <w:tr>
         <w:tc>
           <w:tcPr>
-            <w:tcW w:w="2400" w:type="dxa"/>
-          </w:tcPr>
-          <w:p>
-            <w:pPr>
-              <w:jc w:val="center"/>
-            </w:pPr>
-            <w:r>
-              <w:t>Multi-agent RL</w:t>
-            </w:r>
-          </w:p>
-        </w:tc>
-        <w:tc>
-          <w:tcPr>
-            <w:tcW w:w="2400" w:type="dxa"/>
-          </w:tcPr>
-          <w:p>
-            <w:pPr>
-              <w:jc w:val="center"/>
-            </w:pPr>
-            <w:r>
-              <w:t>10 scenarios x 10 experiments x 10 simulations</w:t>
-            </w:r>
-          </w:p>
-        </w:tc>
-        <w:tc>
-          <w:tcPr>
-            <w:tcW w:w="2400" w:type="dxa"/>
-          </w:tcPr>
-          <w:p>
-            <w:pPr>
-              <w:jc w:val="center"/>
-            </w:pPr>
-            <w:r>
-              <w:t>1000</w:t>
-            </w:r>
-          </w:p>
-        </w:tc>
-        <w:tc>
-          <w:tcPr>
-            <w:tcW w:w="2400" w:type="dxa"/>
-          </w:tcPr>
-          <w:p>
-            <w:pPr>
-              <w:jc w:val="center"/>
-            </w:pPr>
-            <w:r>
-              <w:t>4000</w:t>
-            </w:r>
-          </w:p>
-        </w:tc>
-        <w:tc>
-          <w:tcPr>
-            <w:tcW w:w="2400" w:type="dxa"/>
-          </w:tcPr>
-          <w:p>
-            <w:pPr>
-              <w:jc w:val="center"/>
-            </w:pPr>
-            <w:r>
-              <w:t>5000</w:t>
-            </w:r>
-          </w:p>
-        </w:tc>
-      </w:tr>
-      <w:tr>
-        <w:tc>
-          <w:tcPr>
-            <w:tcW w:w="2400" w:type="dxa"/>
+            <w:tcW w:w="1973" w:type="dxa"/>
           </w:tcPr>
           <w:p>
             <w:pPr>
@@ -2459,50 +2392,56 @@
         </w:tc>
         <w:tc>
           <w:tcPr>
-            <w:tcW w:w="2400" w:type="dxa"/>
-          </w:tcPr>
-          <w:p>
-            <w:pPr>
-              <w:jc w:val="center"/>
-            </w:pPr>
-          </w:p>
-        </w:tc>
-        <w:tc>
-          <w:tcPr>
-            <w:tcW w:w="2400" w:type="dxa"/>
-          </w:tcPr>
-          <w:p>
-            <w:pPr>
-              <w:jc w:val="center"/>
-            </w:pPr>
-            <w:r>
-              <w:t>3100</w:t>
-            </w:r>
-          </w:p>
-        </w:tc>
-        <w:tc>
-          <w:tcPr>
-            <w:tcW w:w="2400" w:type="dxa"/>
-          </w:tcPr>
-          <w:p>
-            <w:pPr>
-              <w:jc w:val="center"/>
-            </w:pPr>
-            <w:r>
-              <w:t>12400</w:t>
-            </w:r>
-          </w:p>
-        </w:tc>
-        <w:tc>
-          <w:tcPr>
-            <w:tcW w:w="2400" w:type="dxa"/>
-          </w:tcPr>
-          <w:p>
-            <w:pPr>
-              <w:jc w:val="center"/>
-            </w:pPr>
-            <w:r>
-              <w:t>15500</w:t>
+            <w:tcW w:w="2003" w:type="dxa"/>
+          </w:tcPr>
+          <w:p>
+            <w:pPr>
+              <w:jc w:val="center"/>
+            </w:pPr>
+          </w:p>
+        </w:tc>
+        <w:tc>
+          <w:tcPr>
+            <w:tcW w:w="1771" w:type="dxa"/>
+          </w:tcPr>
+          <w:p>
+            <w:pPr>
+              <w:jc w:val="center"/>
+            </w:pPr>
+            <w:r>
+              <w:t>2100</w:t>
+            </w:r>
+          </w:p>
+        </w:tc>
+        <w:tc>
+          <w:tcPr>
+            <w:tcW w:w="1809" w:type="dxa"/>
+          </w:tcPr>
+          <w:p>
+            <w:pPr>
+              <w:jc w:val="center"/>
+            </w:pPr>
+            <w:r>
+              <w:t>8400</w:t>
+            </w:r>
+          </w:p>
+        </w:tc>
+        <w:tc>
+          <w:tcPr>
+            <w:tcW w:w="1809" w:type="dxa"/>
+          </w:tcPr>
+          <w:p>
+            <w:pPr>
+              <w:jc w:val="center"/>
+            </w:pPr>
+            <w:r>
+              <w:t>1</w:t>
+            </w:r>
+            <w:r>
+              <w:t>0</w:t>
+            </w:r>
+            <w:r>
+              <w:t>500</w:t>
             </w:r>
           </w:p>
         </w:tc>
@@ -2510,602 +2449,310 @@
     </w:tbl>
     <w:p>
       <w:r>
+        <w:t>The full study contains 1</w:t>
+      </w:r>
+      <w:r>
+        <w:t>0</w:t>
+      </w:r>
+      <w:r>
+        <w:t xml:space="preserve">500 runs: </w:t>
+      </w:r>
+      <w:r>
+        <w:t>2</w:t>
+      </w:r>
+      <w:r>
+        <w:t xml:space="preserve">100 E1 runs and </w:t>
+      </w:r>
+      <w:r>
+        <w:t>8</w:t>
+      </w:r>
+      <w:r>
+        <w:t>400 E2 runs. The E2 count is larger because it repeats the failure experiment under four failure timing modes.</w:t>
+      </w:r>
+    </w:p>
+    <w:p>
+      <w:pPr>
+        <w:pStyle w:val="Heading1"/>
+      </w:pPr>
+      <w:r>
         <w:lastRenderedPageBreak/>
-        <w:t>The full study contains 15500 runs: 3100 E1 runs and 12400 E2 runs. The E2 count is larger because it repeats the failure experiment under four failure timing modes.</w:t>
-      </w:r>
-    </w:p>
-    <w:p>
-      <w:pPr>
-        <w:pStyle w:val="Heading1"/>
-      </w:pPr>
-      <w:r>
-        <w:t>Visited Cell Heatmap Comparison</w:t>
-      </w:r>
-    </w:p>
-    <w:p>
-      <w:r>
-        <w:t>The following four heatmaps compare the spatial coverage behavior of the algorithms under the same no-failure visualization configuration: a 100 x 100 grid, 10 robots, 5 targets, robot radius 1, and no robot failures. The images use the same robot and target placement for the comparison run, so the main difference is the movement policy used by each algorithm. Darker red cells indicate more repeated visits.</w:t>
-      </w:r>
-    </w:p>
-    <w:p>
-      <w:r>
-        <w:t>The strongest contrast is in revisit concentration. Stigmergy search has the lowest maximum revisit count at 19, while centralized search is very close at 20. Multi-agent RL reaches a maximum of 79 visits, and stigmergy random walk reaches 84 visits. In relative terms, the random walk hotspot is 4.42 times higher than stigmergy search and 4.2 times higher than centralized search. Multi-agent RL is also high at 3.95 times the centralized maximum. This suggests that the directed stigmergy search and centralized sweep distribute coverage more evenly, while random walk and the current RL policy spend more time revisiting local regions before spreading across the grid.</w:t>
-      </w:r>
-    </w:p>
-    <w:tbl>
-      <w:tblPr>
-        <w:tblStyle w:val="TableGrid"/>
-        <w:tblW w:w="0" w:type="auto"/>
-        <w:jc w:val="center"/>
-        <w:tblInd w:w="0" w:type="dxa"/>
-        <w:tblLook w:val="04A0" w:firstRow="1" w:lastRow="0" w:firstColumn="1" w:lastColumn="0" w:noHBand="0" w:noVBand="1"/>
-      </w:tblPr>
-      <w:tblGrid>
-        <w:gridCol w:w="2465"/>
-        <w:gridCol w:w="2465"/>
-        <w:gridCol w:w="2465"/>
-      </w:tblGrid>
-      <w:tr>
-        <w:trPr>
-          <w:trHeight w:val="475"/>
-          <w:jc w:val="center"/>
-        </w:trPr>
-        <w:tc>
-          <w:tcPr>
-            <w:tcW w:w="2465" w:type="dxa"/>
-          </w:tcPr>
-          <w:p>
-            <w:pPr>
-              <w:jc w:val="center"/>
-            </w:pPr>
-            <w:r>
-              <w:rPr>
-                <w:b/>
-              </w:rPr>
-              <w:t>Algorithm</w:t>
-            </w:r>
-          </w:p>
-        </w:tc>
-        <w:tc>
-          <w:tcPr>
-            <w:tcW w:w="2465" w:type="dxa"/>
-          </w:tcPr>
-          <w:p>
-            <w:pPr>
-              <w:jc w:val="center"/>
-            </w:pPr>
-            <w:r>
-              <w:rPr>
-                <w:b/>
-              </w:rPr>
-              <w:t>Max visits</w:t>
-            </w:r>
-          </w:p>
-        </w:tc>
-        <w:tc>
-          <w:tcPr>
-            <w:tcW w:w="2465" w:type="dxa"/>
-          </w:tcPr>
-          <w:p>
-            <w:pPr>
-              <w:jc w:val="center"/>
-            </w:pPr>
-            <w:r>
-              <w:rPr>
-                <w:b/>
-              </w:rPr>
-              <w:t>Comparison insight</w:t>
-            </w:r>
-          </w:p>
-        </w:tc>
-      </w:tr>
-      <w:tr>
-        <w:trPr>
-          <w:trHeight w:val="793"/>
-          <w:jc w:val="center"/>
-        </w:trPr>
-        <w:tc>
-          <w:tcPr>
-            <w:tcW w:w="2465" w:type="dxa"/>
-          </w:tcPr>
-          <w:p>
-            <w:pPr>
-              <w:jc w:val="center"/>
-            </w:pPr>
-            <w:r>
-              <w:t>Centralized search</w:t>
-            </w:r>
-          </w:p>
-        </w:tc>
-        <w:tc>
-          <w:tcPr>
-            <w:tcW w:w="2465" w:type="dxa"/>
-          </w:tcPr>
-          <w:p>
-            <w:pPr>
-              <w:jc w:val="center"/>
-            </w:pPr>
-            <w:r>
-              <w:t>20</w:t>
-            </w:r>
-          </w:p>
-        </w:tc>
-        <w:tc>
-          <w:tcPr>
-            <w:tcW w:w="2465" w:type="dxa"/>
-          </w:tcPr>
-          <w:p>
-            <w:pPr>
-              <w:jc w:val="center"/>
-            </w:pPr>
-            <w:r>
-              <w:t>Structured sweep with low revisit concentration.</w:t>
-            </w:r>
-          </w:p>
-        </w:tc>
-      </w:tr>
-      <w:tr>
-        <w:trPr>
-          <w:trHeight w:val="1420"/>
-          <w:jc w:val="center"/>
-        </w:trPr>
-        <w:tc>
-          <w:tcPr>
-            <w:tcW w:w="2465" w:type="dxa"/>
-          </w:tcPr>
-          <w:p>
-            <w:pPr>
-              <w:jc w:val="center"/>
-            </w:pPr>
-            <w:r>
-              <w:t>Multi-agent RL</w:t>
-            </w:r>
-          </w:p>
-        </w:tc>
-        <w:tc>
-          <w:tcPr>
-            <w:tcW w:w="2465" w:type="dxa"/>
-          </w:tcPr>
-          <w:p>
-            <w:pPr>
-              <w:jc w:val="center"/>
-            </w:pPr>
-            <w:r>
-              <w:t>79</w:t>
-            </w:r>
-          </w:p>
-        </w:tc>
-        <w:tc>
-          <w:tcPr>
-            <w:tcW w:w="2465" w:type="dxa"/>
-          </w:tcPr>
-          <w:p>
-            <w:pPr>
-              <w:jc w:val="center"/>
-            </w:pPr>
-            <w:r>
-              <w:t>3.95 times the centralized max and 4.16 times the stigmergy search max.</w:t>
-            </w:r>
-          </w:p>
-        </w:tc>
-      </w:tr>
-      <w:tr>
-        <w:trPr>
-          <w:trHeight w:val="1415"/>
-          <w:jc w:val="center"/>
-        </w:trPr>
-        <w:tc>
-          <w:tcPr>
-            <w:tcW w:w="2465" w:type="dxa"/>
-          </w:tcPr>
-          <w:p>
-            <w:pPr>
-              <w:jc w:val="center"/>
-            </w:pPr>
-            <w:r>
-              <w:t>Stigmergy random walk</w:t>
-            </w:r>
-          </w:p>
-        </w:tc>
-        <w:tc>
-          <w:tcPr>
-            <w:tcW w:w="2465" w:type="dxa"/>
-          </w:tcPr>
-          <w:p>
-            <w:pPr>
-              <w:jc w:val="center"/>
-            </w:pPr>
-            <w:r>
-              <w:t>84</w:t>
-            </w:r>
-          </w:p>
-        </w:tc>
-        <w:tc>
-          <w:tcPr>
-            <w:tcW w:w="2465" w:type="dxa"/>
-          </w:tcPr>
-          <w:p>
-            <w:pPr>
-              <w:jc w:val="center"/>
-            </w:pPr>
-            <w:r>
-              <w:t>Highest revisit hotspot, 4.2 times centralized and 4.42 times stigmergy search.</w:t>
-            </w:r>
-          </w:p>
-        </w:tc>
-      </w:tr>
-      <w:tr>
-        <w:trPr>
-          <w:trHeight w:val="1107"/>
-          <w:jc w:val="center"/>
-        </w:trPr>
-        <w:tc>
-          <w:tcPr>
-            <w:tcW w:w="2465" w:type="dxa"/>
-          </w:tcPr>
-          <w:p>
-            <w:pPr>
-              <w:jc w:val="center"/>
-            </w:pPr>
-            <w:r>
-              <w:t>Stigmergy search</w:t>
-            </w:r>
-          </w:p>
-        </w:tc>
-        <w:tc>
-          <w:tcPr>
-            <w:tcW w:w="2465" w:type="dxa"/>
-          </w:tcPr>
-          <w:p>
-            <w:pPr>
-              <w:jc w:val="center"/>
-            </w:pPr>
-            <w:r>
-              <w:t>19</w:t>
-            </w:r>
-          </w:p>
-        </w:tc>
-        <w:tc>
-          <w:tcPr>
-            <w:tcW w:w="2465" w:type="dxa"/>
-          </w:tcPr>
-          <w:p>
-            <w:pPr>
-              <w:jc w:val="center"/>
-            </w:pPr>
-            <w:r>
-              <w:t>Lowest maximum revisit count, 5 percent lower than centralized.</w:t>
-            </w:r>
-          </w:p>
-        </w:tc>
-      </w:tr>
-    </w:tbl>
+        <w:t>Metrics Collected and Output Storage</w:t>
+      </w:r>
+    </w:p>
+    <w:p>
+      <w:r>
+        <w:t>The experiment runners store scalar run-level metrics in results.xlsx and graph-ready sampled time-series metrics in CSV files. The same schema is used for E1 and E2 so plots can compare centralized search, random walk, and stigmergy search without special-case processing.</w:t>
+      </w:r>
+    </w:p>
     <w:p>
       <w:pPr>
         <w:pStyle w:val="Heading2"/>
       </w:pPr>
+      <w:r>
+        <w:t>Core Run-Level Metrics</w:t>
+      </w:r>
+    </w:p>
+    <w:p>
+      <w:r>
+        <w:t>n_targets_found: number of targets discovered by the end of the run.</w:t>
+      </w:r>
+    </w:p>
+    <w:p>
+      <w:r>
+        <w:t>t_targets: timestep when all targets are found. If all targets are not found, this is set to the timeout horizon.</w:t>
+      </w:r>
+    </w:p>
+    <w:p>
+      <w:r>
+        <w:t>t_coverage: timestep when full grid coverage is reached. If full coverage is not reached, this is set to the timeout horizon.</w:t>
+      </w:r>
+    </w:p>
+    <w:p>
+      <w:r>
+        <w:t>percent_coverage: final percentage of grid cells covered by the end of the run.</w:t>
+      </w:r>
+    </w:p>
+    <w:p>
+      <w:r>
+        <w:t>mean_found: average target discovery fraction over the executed timesteps. This is retained for compatibility with the original results.</w:t>
+      </w:r>
+    </w:p>
+    <w:p>
+      <w:r>
+        <w:t>max_horizon: timeout horizon for the scenario, computed from grid size, robot count, and KAPPA.</w:t>
+      </w:r>
+    </w:p>
+    <w:p>
+      <w:r>
+        <w:t>steps_executed: number of simulated steps before completion or timeout.</w:t>
+      </w:r>
+    </w:p>
+    <w:p>
+      <w:r>
+        <w:t>final_coverage_cells: number of covered grid cells at the end of the run.</w:t>
+      </w:r>
+    </w:p>
+    <w:p>
+      <w:r>
+        <w:t>final_coverage_fraction: final covered-cell fraction, equal to final_coverage_cells divided by total grid cells.</w:t>
+      </w:r>
+    </w:p>
+    <w:p>
+      <w:r>
+        <w:t>final_targets_fraction: final discovered-target fraction, equal to n_targets_found divided by n_targets.</w:t>
+      </w:r>
     </w:p>
     <w:p>
       <w:pPr>
         <w:pStyle w:val="Heading2"/>
       </w:pPr>
+      <w:r>
+        <w:t>AUC Metrics</w:t>
+      </w:r>
+    </w:p>
+    <w:p>
+      <w:r>
+        <w:t>coverage_auc_executed: average coverage fraction over the timesteps that were actually simulated.</w:t>
+      </w:r>
+    </w:p>
+    <w:p>
+      <w:r>
+        <w:t>target_auc_executed: average target discovery fraction over the timesteps that were actually simulated.</w:t>
+      </w:r>
+    </w:p>
+    <w:p>
+      <w:r>
+        <w:t>coverage_auc_horizon_norm: coverage AUC normalized over the full max_horizon. If a run finishes early, final values are padded through the remaining horizon.</w:t>
+      </w:r>
+    </w:p>
+    <w:p>
+      <w:r>
+        <w:t>target_auc_horizon_norm: target discovery AUC normalized over the full max_horizon. If a run finishes early, final values are padded through the remaining horizon.</w:t>
+      </w:r>
     </w:p>
     <w:p>
       <w:pPr>
         <w:pStyle w:val="Heading2"/>
       </w:pPr>
+      <w:r>
+        <w:t>Redundancy Metrics</w:t>
+      </w:r>
+    </w:p>
+    <w:p>
+      <w:r>
+        <w:lastRenderedPageBreak/>
+        <w:t>total_cell_observations: total number of robot footprint observations across all grid cells. The footprint uses the same robot_radius semantics as coverage.</w:t>
+      </w:r>
+    </w:p>
+    <w:p>
+      <w:r>
+        <w:t>avg_visits_per_covered_cell: total_cell_observations divided by the number of cells covered at least once.</w:t>
+      </w:r>
+    </w:p>
+    <w:p>
+      <w:r>
+        <w:t>extra_visits_per_covered_cell: average redundant observations beyond the first observation for covered cells.</w:t>
+      </w:r>
+    </w:p>
+    <w:p>
+      <w:r>
+        <w:t>pct_revisited_cells: percentage of grid cells observed more than once.</w:t>
+      </w:r>
     </w:p>
     <w:p>
       <w:pPr>
         <w:pStyle w:val="Heading2"/>
       </w:pPr>
       <w:r>
+        <w:t>Success and Failure Metrics</w:t>
+      </w:r>
+    </w:p>
+    <w:p>
+      <w:r>
+        <w:t>success_targets: 1 if all targets are found before timeout, otherwise 0.</w:t>
+      </w:r>
+    </w:p>
+    <w:p>
+      <w:r>
+        <w:t>success_coverage: 1 if full coverage is reached before timeout, otherwise 0.</w:t>
+      </w:r>
+    </w:p>
+    <w:p>
+      <w:r>
+        <w:t>failure_time_mode: E2 sub-experiment label. The parallel E2 runners use mixed, early, middle, and late.</w:t>
+      </w:r>
+    </w:p>
+    <w:p>
+      <w:r>
+        <w:t>failed_robot_ids: semicolon-separated list of failed robot IDs for the run.</w:t>
+      </w:r>
+    </w:p>
+    <w:p>
+      <w:r>
+        <w:t>failure_steps: semicolon-separated list of failure timesteps for the run.</w:t>
+      </w:r>
+    </w:p>
+    <w:p>
+      <w:r>
+        <w:t>first_failure_step: earliest failure timestep in the run.</w:t>
+      </w:r>
+    </w:p>
+    <w:p>
+      <w:r>
+        <w:t>last_failure_step: latest failure timestep in the run.</w:t>
+      </w:r>
+    </w:p>
+    <w:p>
+      <w:r>
+        <w:t>targets_found_at_first_failure: number of discovered targets when the first failure has taken effect.</w:t>
+      </w:r>
+    </w:p>
+    <w:p>
+      <w:r>
+        <w:t>coverage_fraction_at_first_failure: coverage fraction when the first failure has taken effect.</w:t>
+      </w:r>
+    </w:p>
+    <w:p>
+      <w:r>
+        <w:t>post_failure_target_auc: average target discovery fraction after the first failure.</w:t>
+      </w:r>
+    </w:p>
+    <w:p>
+      <w:r>
+        <w:t>post_failure_coverage_auc: average coverage fraction after the first failure.</w:t>
+      </w:r>
+    </w:p>
+    <w:p>
+      <w:pPr>
+        <w:pStyle w:val="Heading2"/>
+      </w:pPr>
+      <w:r>
+        <w:t>E1 Storage</w:t>
+      </w:r>
+    </w:p>
+    <w:p>
+      <w:r>
+        <w:t>E1 is the no-failure baseline. FAILURE_COUNTS is set to zero for every configured scenario. Results are written to the E1 folder for each algorithm output directory.</w:t>
+      </w:r>
+    </w:p>
+    <w:p>
+      <w:r>
+        <w:t>Centralized E1 output: experiment_results/E1/. Random walk E1 output: experiment_results_stigmergy/E1/. Stigmergy search E1 output: experiment_results_stigmergy_efficient/E1/.</w:t>
+      </w:r>
+    </w:p>
+    <w:p>
+      <w:r>
+        <w:t>Each E1 folder contains results.xlsx, timeseries_sampled.csv, and timeseries_summary.csv.</w:t>
+      </w:r>
+    </w:p>
+    <w:p>
+      <w:pPr>
+        <w:pStyle w:val="Heading2"/>
+      </w:pPr>
+      <w:r>
+        <w:t>E2 Storage</w:t>
+      </w:r>
+    </w:p>
+    <w:p>
+      <w:r>
+        <w:t>E2 is the failure robustness experiment. FAILURE_COUNTS contains nonzero values. The parallel runners automatically repeat each scenario for mixed, early, middle, and late failure timing modes.</w:t>
+      </w:r>
+    </w:p>
+    <w:p>
+      <w:r>
         <w:lastRenderedPageBreak/>
-        <w:t>Centralized search</w:t>
-      </w:r>
-    </w:p>
-    <w:p>
-      <w:r>
-        <w:rPr>
-          <w:noProof/>
-        </w:rPr>
-        <w:drawing>
-          <wp:inline distT="0" distB="0" distL="0" distR="0" wp14:anchorId="45268217" wp14:editId="2F084561">
-            <wp:extent cx="5394960" cy="5394960"/>
-            <wp:effectExtent l="0" t="0" r="0" b="0"/>
-            <wp:docPr id="102" name="visited_cells_centralized.png"/>
-            <wp:cNvGraphicFramePr/>
-            <a:graphic xmlns:a="http://schemas.openxmlformats.org/drawingml/2006/main">
-              <a:graphicData uri="http://schemas.openxmlformats.org/drawingml/2006/picture">
-                <pic:pic xmlns:pic="http://schemas.openxmlformats.org/drawingml/2006/picture">
-                  <pic:nvPicPr>
-                    <pic:cNvPr id="0" name="visited_cells_centralized.png"/>
-                    <pic:cNvPicPr/>
-                  </pic:nvPicPr>
-                  <pic:blipFill>
-                    <a:blip r:embed="rId6"/>
-                    <a:stretch>
-                      <a:fillRect/>
-                    </a:stretch>
-                  </pic:blipFill>
-                  <pic:spPr>
-                    <a:xfrm>
-                      <a:off x="0" y="0"/>
-                      <a:ext cx="5394960" cy="5394960"/>
-                    </a:xfrm>
-                    <a:prstGeom prst="rect">
-                      <a:avLst/>
-                    </a:prstGeom>
-                  </pic:spPr>
-                </pic:pic>
-              </a:graphicData>
-            </a:graphic>
-          </wp:inline>
-        </w:drawing>
-      </w:r>
-    </w:p>
-    <w:p>
-      <w:r>
-        <w:rPr>
-          <w:i/>
-        </w:rPr>
-        <w:t>Figure 2. Centralized search visit-count heatmap. The maximum visit count is 20.</w:t>
+        <w:t>Centralized E2 output: experiment_results/E2/. Random walk E2 output: experiment_results_stigmergy/E2/. Stigmergy search E2 output: experiment_results_stigmergy_efficient/E2/.</w:t>
+      </w:r>
+    </w:p>
+    <w:p>
+      <w:r>
+        <w:t>Each E2 folder contains the same files as E1, with additional failure-related scalar fields in results.xlsx and failure_time_mode in both scalar and time-series outputs.</w:t>
       </w:r>
     </w:p>
     <w:p>
       <w:pPr>
         <w:pStyle w:val="Heading2"/>
       </w:pPr>
+      <w:r>
+        <w:t>Excel Output</w:t>
+      </w:r>
+    </w:p>
+    <w:p>
+      <w:r>
+        <w:t>results.xlsx contains a detailed sheet and a summary sheet. The detailed sheet stores one row per run or simulation. The summary sheet stores grouped averages by algorithm, grid size, robot count, failure count, and failure timing mode.</w:t>
+      </w:r>
     </w:p>
     <w:p>
       <w:pPr>
         <w:pStyle w:val="Heading2"/>
       </w:pPr>
-    </w:p>
-    <w:p>
-      <w:pPr>
-        <w:pStyle w:val="Heading2"/>
-      </w:pPr>
-    </w:p>
-    <w:p>
-      <w:pPr>
-        <w:pStyle w:val="Heading2"/>
-      </w:pPr>
-    </w:p>
-    <w:p>
-      <w:pPr>
-        <w:pStyle w:val="Heading2"/>
-      </w:pPr>
-    </w:p>
-    <w:p>
-      <w:pPr>
-        <w:pStyle w:val="Heading2"/>
-      </w:pPr>
-      <w:r>
-        <w:lastRenderedPageBreak/>
-        <w:t>Multi-agent RL</w:t>
-      </w:r>
-    </w:p>
-    <w:p>
-      <w:r>
-        <w:rPr>
-          <w:noProof/>
-        </w:rPr>
-        <w:drawing>
-          <wp:inline distT="0" distB="0" distL="0" distR="0" wp14:anchorId="0FA115D2" wp14:editId="7DDC39BD">
-            <wp:extent cx="5394960" cy="5394960"/>
-            <wp:effectExtent l="0" t="0" r="0" b="0"/>
-            <wp:docPr id="103" name="visited_cells_multi_agent_rl.png"/>
-            <wp:cNvGraphicFramePr/>
-            <a:graphic xmlns:a="http://schemas.openxmlformats.org/drawingml/2006/main">
-              <a:graphicData uri="http://schemas.openxmlformats.org/drawingml/2006/picture">
-                <pic:pic xmlns:pic="http://schemas.openxmlformats.org/drawingml/2006/picture">
-                  <pic:nvPicPr>
-                    <pic:cNvPr id="0" name="visited_cells_multi_agent_rl.png"/>
-                    <pic:cNvPicPr/>
-                  </pic:nvPicPr>
-                  <pic:blipFill>
-                    <a:blip r:embed="rId7"/>
-                    <a:stretch>
-                      <a:fillRect/>
-                    </a:stretch>
-                  </pic:blipFill>
-                  <pic:spPr>
-                    <a:xfrm>
-                      <a:off x="0" y="0"/>
-                      <a:ext cx="5394960" cy="5394960"/>
-                    </a:xfrm>
-                    <a:prstGeom prst="rect">
-                      <a:avLst/>
-                    </a:prstGeom>
-                  </pic:spPr>
-                </pic:pic>
-              </a:graphicData>
-            </a:graphic>
-          </wp:inline>
-        </w:drawing>
-      </w:r>
-    </w:p>
-    <w:p>
-      <w:r>
-        <w:rPr>
-          <w:i/>
-        </w:rPr>
-        <w:t>Figure 3. Multi-agent RL visit-count heatmap. The maximum visit count is 79.</w:t>
-      </w:r>
-    </w:p>
-    <w:p>
-      <w:pPr>
-        <w:pStyle w:val="Heading2"/>
-      </w:pPr>
-    </w:p>
-    <w:p>
-      <w:pPr>
-        <w:pStyle w:val="Heading2"/>
-      </w:pPr>
-    </w:p>
-    <w:p>
-      <w:pPr>
-        <w:pStyle w:val="Heading2"/>
-      </w:pPr>
-    </w:p>
-    <w:p>
-      <w:pPr>
-        <w:pStyle w:val="Heading2"/>
-      </w:pPr>
-    </w:p>
-    <w:p>
-      <w:pPr>
-        <w:pStyle w:val="Heading2"/>
-      </w:pPr>
-    </w:p>
-    <w:p>
-      <w:pPr>
-        <w:pStyle w:val="Heading2"/>
-      </w:pPr>
-      <w:proofErr w:type="spellStart"/>
-      <w:r>
-        <w:lastRenderedPageBreak/>
-        <w:t>Stigmergy</w:t>
-      </w:r>
-      <w:proofErr w:type="spellEnd"/>
-      <w:r>
-        <w:t xml:space="preserve"> random walk</w:t>
-      </w:r>
-    </w:p>
-    <w:p>
-      <w:r>
-        <w:rPr>
-          <w:noProof/>
-        </w:rPr>
-        <w:drawing>
-          <wp:inline distT="0" distB="0" distL="0" distR="0" wp14:anchorId="666CC30B" wp14:editId="75837674">
-            <wp:extent cx="5394960" cy="5394960"/>
-            <wp:effectExtent l="0" t="0" r="0" b="0"/>
-            <wp:docPr id="104" name="visited_cell_stigmergy_random_walk.png"/>
-            <wp:cNvGraphicFramePr/>
-            <a:graphic xmlns:a="http://schemas.openxmlformats.org/drawingml/2006/main">
-              <a:graphicData uri="http://schemas.openxmlformats.org/drawingml/2006/picture">
-                <pic:pic xmlns:pic="http://schemas.openxmlformats.org/drawingml/2006/picture">
-                  <pic:nvPicPr>
-                    <pic:cNvPr id="0" name="visited_cell_stigmergy_random_walk.png"/>
-                    <pic:cNvPicPr/>
-                  </pic:nvPicPr>
-                  <pic:blipFill>
-                    <a:blip r:embed="rId8"/>
-                    <a:stretch>
-                      <a:fillRect/>
-                    </a:stretch>
-                  </pic:blipFill>
-                  <pic:spPr>
-                    <a:xfrm>
-                      <a:off x="0" y="0"/>
-                      <a:ext cx="5394960" cy="5394960"/>
-                    </a:xfrm>
-                    <a:prstGeom prst="rect">
-                      <a:avLst/>
-                    </a:prstGeom>
-                  </pic:spPr>
-                </pic:pic>
-              </a:graphicData>
-            </a:graphic>
-          </wp:inline>
-        </w:drawing>
-      </w:r>
-    </w:p>
-    <w:p>
-      <w:r>
-        <w:rPr>
-          <w:i/>
-        </w:rPr>
-        <w:t>Figure 4. Stigmergy random walk visit-count heatmap. The maximum visit count is 84.</w:t>
-      </w:r>
-    </w:p>
-    <w:p>
-      <w:pPr>
-        <w:pStyle w:val="Heading2"/>
-      </w:pPr>
-    </w:p>
-    <w:p>
-      <w:pPr>
-        <w:pStyle w:val="Heading2"/>
-      </w:pPr>
-    </w:p>
-    <w:p>
-      <w:pPr>
-        <w:pStyle w:val="Heading2"/>
-      </w:pPr>
-    </w:p>
-    <w:p>
-      <w:pPr>
-        <w:pStyle w:val="Heading2"/>
-      </w:pPr>
-    </w:p>
-    <w:p>
-      <w:pPr>
-        <w:pStyle w:val="Heading2"/>
-      </w:pPr>
-    </w:p>
-    <w:p>
-      <w:pPr>
-        <w:pStyle w:val="Heading2"/>
-      </w:pPr>
-      <w:proofErr w:type="spellStart"/>
-      <w:r>
-        <w:lastRenderedPageBreak/>
-        <w:t>Stigmergy</w:t>
-      </w:r>
-      <w:proofErr w:type="spellEnd"/>
-      <w:r>
-        <w:t xml:space="preserve"> search</w:t>
-      </w:r>
-    </w:p>
-    <w:p>
-      <w:r>
-        <w:rPr>
-          <w:noProof/>
-        </w:rPr>
-        <w:drawing>
-          <wp:inline distT="0" distB="0" distL="0" distR="0" wp14:anchorId="4F642AD7" wp14:editId="50CC46C2">
-            <wp:extent cx="5394960" cy="5394960"/>
-            <wp:effectExtent l="0" t="0" r="0" b="0"/>
-            <wp:docPr id="105" name="visited_cells_stigmergy_search_efficient.png"/>
-            <wp:cNvGraphicFramePr/>
-            <a:graphic xmlns:a="http://schemas.openxmlformats.org/drawingml/2006/main">
-              <a:graphicData uri="http://schemas.openxmlformats.org/drawingml/2006/picture">
-                <pic:pic xmlns:pic="http://schemas.openxmlformats.org/drawingml/2006/picture">
-                  <pic:nvPicPr>
-                    <pic:cNvPr id="0" name="visited_cells_stigmergy_search_efficient.png"/>
-                    <pic:cNvPicPr/>
-                  </pic:nvPicPr>
-                  <pic:blipFill>
-                    <a:blip r:embed="rId9"/>
-                    <a:stretch>
-                      <a:fillRect/>
-                    </a:stretch>
-                  </pic:blipFill>
-                  <pic:spPr>
-                    <a:xfrm>
-                      <a:off x="0" y="0"/>
-                      <a:ext cx="5394960" cy="5394960"/>
-                    </a:xfrm>
-                    <a:prstGeom prst="rect">
-                      <a:avLst/>
-                    </a:prstGeom>
-                  </pic:spPr>
-                </pic:pic>
-              </a:graphicData>
-            </a:graphic>
-          </wp:inline>
-        </w:drawing>
-      </w:r>
-    </w:p>
-    <w:p>
-      <w:r>
-        <w:rPr>
-          <w:i/>
-        </w:rPr>
-        <w:t>Figure 5. Stigmergy search visit-count heatmap. The maximum visit count is 19.</w:t>
+      <w:r>
+        <w:t>Time-Series Output</w:t>
+      </w:r>
+    </w:p>
+    <w:p>
+      <w:r>
+        <w:t>timeseries_sampled.csv stores graph-ready sampled curves in long format. Each run contributes 201 samples from time_fraction 0.0 to 1.0. This avoids storing every timestep while preserving smooth curves for plotting.</w:t>
+      </w:r>
+    </w:p>
+    <w:p>
+      <w:r>
+        <w:t>Run identity columns include algorithm, grid_size, n_robots, n_targets, n_failures, failure_time_mode, experiment_id, and simulation_id when applicable.</w:t>
+      </w:r>
+    </w:p>
+    <w:p>
+      <w:r>
+        <w:t>Time identity columns include sample_idx, step, and time_fraction.</w:t>
+      </w:r>
+    </w:p>
+    <w:p>
+      <w:r>
+        <w:t>Curve value columns include coverage_cells, coverage_fraction, targets_found, target_fraction, active_robots, avg_visits_per_covered_cell, and pct_revisited_cells.</w:t>
+      </w:r>
+    </w:p>
+    <w:p>
+      <w:r>
+        <w:t>timeseries_summary.csv groups sampled curves by scenario and time sample. It stores mean, standard deviation, count, and standard error columns for graph creation.</w:t>
       </w:r>
     </w:p>
     <w:sectPr>
@@ -4221,6 +3868,72 @@
       <w:color w:val="666666"/>
     </w:rPr>
   </w:style>
+  <w:style w:type="character" w:styleId="CommentReference">
+    <w:name w:val="annotation reference"/>
+    <w:basedOn w:val="DefaultParagraphFont"/>
+    <w:uiPriority w:val="99"/>
+    <w:semiHidden/>
+    <w:unhideWhenUsed/>
+    <w:rsid w:val="0044658C"/>
+    <w:rPr>
+      <w:sz w:val="16"/>
+      <w:szCs w:val="16"/>
+    </w:rPr>
+  </w:style>
+  <w:style w:type="paragraph" w:styleId="CommentText">
+    <w:name w:val="annotation text"/>
+    <w:basedOn w:val="Normal"/>
+    <w:link w:val="CommentTextChar"/>
+    <w:uiPriority w:val="99"/>
+    <w:unhideWhenUsed/>
+    <w:rsid w:val="0044658C"/>
+    <w:pPr>
+      <w:spacing w:line="240" w:lineRule="auto"/>
+    </w:pPr>
+    <w:rPr>
+      <w:sz w:val="20"/>
+      <w:szCs w:val="20"/>
+    </w:rPr>
+  </w:style>
+  <w:style w:type="character" w:customStyle="1" w:styleId="CommentTextChar">
+    <w:name w:val="Comment Text Char"/>
+    <w:basedOn w:val="DefaultParagraphFont"/>
+    <w:link w:val="CommentText"/>
+    <w:uiPriority w:val="99"/>
+    <w:rsid w:val="0044658C"/>
+    <w:rPr>
+      <w:sz w:val="20"/>
+      <w:szCs w:val="20"/>
+    </w:rPr>
+  </w:style>
+  <w:style w:type="paragraph" w:styleId="CommentSubject">
+    <w:name w:val="annotation subject"/>
+    <w:basedOn w:val="CommentText"/>
+    <w:next w:val="CommentText"/>
+    <w:link w:val="CommentSubjectChar"/>
+    <w:uiPriority w:val="99"/>
+    <w:semiHidden/>
+    <w:unhideWhenUsed/>
+    <w:rsid w:val="0044658C"/>
+    <w:rPr>
+      <w:b/>
+      <w:bCs/>
+    </w:rPr>
+  </w:style>
+  <w:style w:type="character" w:customStyle="1" w:styleId="CommentSubjectChar">
+    <w:name w:val="Comment Subject Char"/>
+    <w:basedOn w:val="CommentTextChar"/>
+    <w:link w:val="CommentSubject"/>
+    <w:uiPriority w:val="99"/>
+    <w:semiHidden/>
+    <w:rsid w:val="0044658C"/>
+    <w:rPr>
+      <w:b/>
+      <w:bCs/>
+      <w:sz w:val="20"/>
+      <w:szCs w:val="20"/>
+    </w:rPr>
+  </w:style>
 </w:styles>
 </file>
 

</xml_diff>